<commit_message>
week 6 check in
</commit_message>
<xml_diff>
--- a/week-5/Critical_Thinking_Assn_5.docx
+++ b/week-5/Critical_Thinking_Assn_5.docx
@@ -5306,6 +5306,34 @@
     <w:p/>
     <w:p>
       <w:r>
+        <w:t xml:space="preserve">GitHub URL: </w:t>
+      </w:r>
+      <w:hyperlink r:id="rId9" w:history="1">
+        <w:r>
+          <w:rPr>
+            <w:rStyle w:val="Hyperlink"/>
+          </w:rPr>
+          <w:t>https://github.com/redpear/Advanced-Python</w:t>
+        </w:r>
+      </w:hyperlink>
+    </w:p>
+    <w:p/>
+    <w:p>
+      <w:r>
+        <w:t xml:space="preserve">GitHub URL Week 5: </w:t>
+      </w:r>
+      <w:hyperlink r:id="rId10" w:history="1">
+        <w:r>
+          <w:rPr>
+            <w:rStyle w:val="Hyperlink"/>
+          </w:rPr>
+          <w:t>https://github.com/redpear/Advanced-Python/tree/main/week-5</w:t>
+        </w:r>
+      </w:hyperlink>
+    </w:p>
+    <w:p/>
+    <w:p>
+      <w:r>
         <w:t>Screenshot 1: Git Commit</w:t>
       </w:r>
     </w:p>
@@ -5328,7 +5356,7 @@
                     <pic:cNvPicPr/>
                   </pic:nvPicPr>
                   <pic:blipFill>
-                    <a:blip r:embed="rId9"/>
+                    <a:blip r:embed="rId11"/>
                     <a:stretch>
                       <a:fillRect/>
                     </a:stretch>
@@ -5376,7 +5404,7 @@
                     <pic:cNvPicPr/>
                   </pic:nvPicPr>
                   <pic:blipFill>
-                    <a:blip r:embed="rId10"/>
+                    <a:blip r:embed="rId12"/>
                     <a:stretch>
                       <a:fillRect/>
                     </a:stretch>
@@ -5417,7 +5445,15 @@
       </w:r>
       <w:proofErr w:type="gramEnd"/>
       <w:r>
-        <w:t xml:space="preserve"> are used without a winner, the program displays a draw. I also used try/except so the game does not crash when someone types a letter instead of a number. </w:t>
+        <w:t xml:space="preserve"> are used without a winner, the program displays a draw. I also used try/</w:t>
+      </w:r>
+      <w:proofErr w:type="gramStart"/>
+      <w:r>
+        <w:t>except</w:t>
+      </w:r>
+      <w:proofErr w:type="gramEnd"/>
+      <w:r>
+        <w:t xml:space="preserve"> so the game does not crash when someone types a letter instead of a number. </w:t>
       </w:r>
     </w:p>
     <w:sectPr>
@@ -6596,6 +6632,29 @@
       <w:szCs w:val="20"/>
     </w:rPr>
   </w:style>
+  <w:style w:type="character" w:styleId="Hyperlink">
+    <w:name w:val="Hyperlink"/>
+    <w:basedOn w:val="DefaultParagraphFont"/>
+    <w:uiPriority w:val="99"/>
+    <w:unhideWhenUsed/>
+    <w:rsid w:val="002B0EDB"/>
+    <w:rPr>
+      <w:color w:val="467886" w:themeColor="hyperlink"/>
+      <w:u w:val="single"/>
+    </w:rPr>
+  </w:style>
+  <w:style w:type="character" w:styleId="UnresolvedMention">
+    <w:name w:val="Unresolved Mention"/>
+    <w:basedOn w:val="DefaultParagraphFont"/>
+    <w:uiPriority w:val="99"/>
+    <w:semiHidden/>
+    <w:unhideWhenUsed/>
+    <w:rsid w:val="002B0EDB"/>
+    <w:rPr>
+      <w:color w:val="605E5C"/>
+      <w:shd w:val="clear" w:color="auto" w:fill="E1DFDD"/>
+    </w:rPr>
+  </w:style>
 </w:styles>
 </file>
 

</xml_diff>